<commit_message>
Update project overview document
</commit_message>
<xml_diff>
--- a/docs/CAD Design Similarity Search - Project Overview.docx
+++ b/docs/CAD Design Similarity Search - Project Overview.docx
@@ -45,7 +45,43 @@
           <w:sz w:val="18"/>
           <w:szCs w:val="18"/>
         </w:rPr>
-        <w:t>Vishal Prabu  |  Industrials, Offshore  |  Independent Technology Exploration</w:t>
+        <w:t xml:space="preserve">Vishal </w:t>
+      </w:r>
+      <w:proofErr w:type="gramStart"/>
+      <w:r>
+        <w:rPr>
+          <w:color w:val="595959"/>
+          <w:sz w:val="18"/>
+          <w:szCs w:val="18"/>
+        </w:rPr>
+        <w:t>Prabu  |</w:t>
+      </w:r>
+      <w:proofErr w:type="gramEnd"/>
+      <w:r>
+        <w:rPr>
+          <w:color w:val="595959"/>
+          <w:sz w:val="18"/>
+          <w:szCs w:val="18"/>
+        </w:rPr>
+        <w:t xml:space="preserve">  Industrials, </w:t>
+      </w:r>
+      <w:proofErr w:type="gramStart"/>
+      <w:r>
+        <w:rPr>
+          <w:color w:val="595959"/>
+          <w:sz w:val="18"/>
+          <w:szCs w:val="18"/>
+        </w:rPr>
+        <w:t>Offshore  |</w:t>
+      </w:r>
+      <w:proofErr w:type="gramEnd"/>
+      <w:r>
+        <w:rPr>
+          <w:color w:val="595959"/>
+          <w:sz w:val="18"/>
+          <w:szCs w:val="18"/>
+        </w:rPr>
+        <w:t xml:space="preserve">  Independent Technology Exploration</w:t>
       </w:r>
     </w:p>
     <w:p>
@@ -185,7 +221,23 @@
         <w:spacing w:after="50"/>
       </w:pPr>
       <w:r>
-        <w:t>Geometry parsing (OpenCascade / occwl): reads STEP files, the neutral CAD exchange format supported by virtually all major CAD systems, and extracts the underlying B-Rep topology, the exact faces, edges, and surface relationships that define the part.</w:t>
+        <w:t>Geometry parsing (</w:t>
+      </w:r>
+      <w:proofErr w:type="spellStart"/>
+      <w:r>
+        <w:t>OpenCascade</w:t>
+      </w:r>
+      <w:proofErr w:type="spellEnd"/>
+      <w:r>
+        <w:t xml:space="preserve"> / </w:t>
+      </w:r>
+      <w:proofErr w:type="spellStart"/>
+      <w:r>
+        <w:t>occwl</w:t>
+      </w:r>
+      <w:proofErr w:type="spellEnd"/>
+      <w:r>
+        <w:t>): reads STEP files, the neutral CAD exchange format supported by virtually all major CAD systems, and extracts the underlying B-Rep topology, the exact faces, edges, and surface relationships that define the part.</w:t>
       </w:r>
     </w:p>
     <w:p>
@@ -198,7 +250,15 @@
         <w:spacing w:after="50"/>
       </w:pPr>
       <w:r>
-        <w:t>Embedding generation (BRepNet): a pretrained deep learning model that operates directly on B-Rep topology, rather than approximating shapes as meshes or point clouds. It converts each design's geometry into a compact numeric “fingerprint” capturing its structural and feature composition.</w:t>
+        <w:t>Embedding generation (</w:t>
+      </w:r>
+      <w:proofErr w:type="spellStart"/>
+      <w:r>
+        <w:t>BRepNet</w:t>
+      </w:r>
+      <w:proofErr w:type="spellEnd"/>
+      <w:r>
+        <w:t>): a pretrained deep learning model that operates directly on B-Rep topology, rather than approximating shapes as meshes or point clouds. It converts each design's geometry into a compact numeric “fingerprint” capturing its structural and feature composition.</w:t>
       </w:r>
     </w:p>
     <w:p>
@@ -338,12 +398,6 @@
         <w:gridCol w:w="2960"/>
       </w:tblGrid>
       <w:tr>
-        <w:tblPrEx>
-          <w:tblCellMar>
-            <w:top w:w="0" w:type="dxa"/>
-            <w:bottom w:w="0" w:type="dxa"/>
-          </w:tblCellMar>
-        </w:tblPrEx>
         <w:tc>
           <w:tcPr>
             <w:tcW w:w="2960" w:type="dxa"/>
@@ -430,12 +484,6 @@
         </w:tc>
       </w:tr>
       <w:tr>
-        <w:tblPrEx>
-          <w:tblCellMar>
-            <w:top w:w="0" w:type="dxa"/>
-            <w:bottom w:w="0" w:type="dxa"/>
-          </w:tblCellMar>
-        </w:tblPrEx>
         <w:tc>
           <w:tcPr>
             <w:tcW w:w="2960" w:type="dxa"/>
@@ -455,7 +503,7 @@
                 <w:noProof/>
               </w:rPr>
               <w:drawing>
-                <wp:inline distT="0" distB="0" distL="0" distR="0">
+                <wp:inline distT="0" distB="0" distL="0" distR="0" wp14:anchorId="4E1C769F" wp14:editId="34FF951E">
                   <wp:extent cx="1000125" cy="1000125"/>
                   <wp:effectExtent l="0" t="0" r="0" b="0"/>
                   <wp:docPr id="1" name="Picture 1"/>
@@ -528,7 +576,7 @@
                 <w:noProof/>
               </w:rPr>
               <w:drawing>
-                <wp:inline distT="0" distB="0" distL="0" distR="0">
+                <wp:inline distT="0" distB="0" distL="0" distR="0" wp14:anchorId="4C087431" wp14:editId="7B5E62E6">
                   <wp:extent cx="1000125" cy="1000125"/>
                   <wp:effectExtent l="0" t="0" r="0" b="0"/>
                   <wp:docPr id="2082565497" name="Picture 2082565497"/>
@@ -574,20 +622,6 @@
             </w:pPr>
             <w:r>
               <w:rPr>
-                <w:color w:val="595959"/>
-                <w:sz w:val="17"/>
-                <w:szCs w:val="17"/>
-              </w:rPr>
-              <w:t>Match 1</w:t>
-            </w:r>
-          </w:p>
-          <w:p>
-            <w:pPr>
-              <w:spacing w:before="60" w:after="40"/>
-              <w:jc w:val="center"/>
-            </w:pPr>
-            <w:r>
-              <w:rPr>
                 <w:b/>
                 <w:bCs/>
                 <w:color w:val="000000"/>
@@ -610,32 +644,50 @@
           </w:tcPr>
           <w:p>
             <w:pPr>
-              <w:spacing w:before="500" w:after="500"/>
               <w:jc w:val="center"/>
+              <w:rPr>
+                <w:noProof/>
+              </w:rPr>
             </w:pPr>
             <w:r>
               <w:rPr>
-                <w:i/>
-                <w:iCs/>
-                <w:color w:val="A6A6A6"/>
-                <w:sz w:val="18"/>
-                <w:szCs w:val="18"/>
-              </w:rPr>
-              <w:t>[Insert screenshot]</w:t>
-            </w:r>
-          </w:p>
-          <w:p>
-            <w:pPr>
-              <w:spacing w:before="60" w:after="40"/>
-              <w:jc w:val="center"/>
-            </w:pPr>
-            <w:r>
-              <w:rPr>
-                <w:color w:val="595959"/>
-                <w:sz w:val="17"/>
-                <w:szCs w:val="17"/>
-              </w:rPr>
-              <w:t>Match 2</w:t>
+                <w:noProof/>
+              </w:rPr>
+              <w:drawing>
+                <wp:inline distT="0" distB="0" distL="0" distR="0" wp14:anchorId="63297FB0" wp14:editId="2CD3887A">
+                  <wp:extent cx="1000800" cy="1000800"/>
+                  <wp:effectExtent l="0" t="0" r="8890" b="8890"/>
+                  <wp:docPr id="1549520333" name="Picture 1"/>
+                  <wp:cNvGraphicFramePr>
+                    <a:graphicFrameLocks xmlns:a="http://schemas.openxmlformats.org/drawingml/2006/main" noChangeAspect="1"/>
+                  </wp:cNvGraphicFramePr>
+                  <a:graphic xmlns:a="http://schemas.openxmlformats.org/drawingml/2006/main">
+                    <a:graphicData uri="http://schemas.openxmlformats.org/drawingml/2006/picture">
+                      <pic:pic xmlns:pic="http://schemas.openxmlformats.org/drawingml/2006/picture">
+                        <pic:nvPicPr>
+                          <pic:cNvPr id="1549520333" name=""/>
+                          <pic:cNvPicPr/>
+                        </pic:nvPicPr>
+                        <pic:blipFill>
+                          <a:blip r:embed="rId7"/>
+                          <a:stretch>
+                            <a:fillRect/>
+                          </a:stretch>
+                        </pic:blipFill>
+                        <pic:spPr>
+                          <a:xfrm>
+                            <a:off x="0" y="0"/>
+                            <a:ext cx="1000800" cy="1000800"/>
+                          </a:xfrm>
+                          <a:prstGeom prst="rect">
+                            <a:avLst/>
+                          </a:prstGeom>
+                        </pic:spPr>
+                      </pic:pic>
+                    </a:graphicData>
+                  </a:graphic>
+                </wp:inline>
+              </w:drawing>
             </w:r>
           </w:p>
           <w:p>
@@ -692,12 +744,6 @@
         <w:gridCol w:w="2960"/>
       </w:tblGrid>
       <w:tr>
-        <w:tblPrEx>
-          <w:tblCellMar>
-            <w:top w:w="0" w:type="dxa"/>
-            <w:bottom w:w="0" w:type="dxa"/>
-          </w:tblCellMar>
-        </w:tblPrEx>
         <w:tc>
           <w:tcPr>
             <w:tcW w:w="2960" w:type="dxa"/>
@@ -784,12 +830,6 @@
         </w:tc>
       </w:tr>
       <w:tr>
-        <w:tblPrEx>
-          <w:tblCellMar>
-            <w:top w:w="0" w:type="dxa"/>
-            <w:bottom w:w="0" w:type="dxa"/>
-          </w:tblCellMar>
-        </w:tblPrEx>
         <w:tc>
           <w:tcPr>
             <w:tcW w:w="2960" w:type="dxa"/>
@@ -802,18 +842,50 @@
           </w:tcPr>
           <w:p>
             <w:pPr>
-              <w:spacing w:before="500" w:after="500"/>
               <w:jc w:val="center"/>
+              <w:rPr>
+                <w:noProof/>
+              </w:rPr>
             </w:pPr>
             <w:r>
               <w:rPr>
-                <w:i/>
-                <w:iCs/>
-                <w:color w:val="A6A6A6"/>
-                <w:sz w:val="18"/>
-                <w:szCs w:val="18"/>
-              </w:rPr>
-              <w:t>[Insert screenshot]</w:t>
+                <w:noProof/>
+              </w:rPr>
+              <w:drawing>
+                <wp:inline distT="0" distB="0" distL="0" distR="0" wp14:anchorId="6DC710F8" wp14:editId="3FEFE7A3">
+                  <wp:extent cx="1000800" cy="1000800"/>
+                  <wp:effectExtent l="0" t="0" r="8890" b="8890"/>
+                  <wp:docPr id="1925234116" name="Picture 1"/>
+                  <wp:cNvGraphicFramePr>
+                    <a:graphicFrameLocks xmlns:a="http://schemas.openxmlformats.org/drawingml/2006/main" noChangeAspect="1"/>
+                  </wp:cNvGraphicFramePr>
+                  <a:graphic xmlns:a="http://schemas.openxmlformats.org/drawingml/2006/main">
+                    <a:graphicData uri="http://schemas.openxmlformats.org/drawingml/2006/picture">
+                      <pic:pic xmlns:pic="http://schemas.openxmlformats.org/drawingml/2006/picture">
+                        <pic:nvPicPr>
+                          <pic:cNvPr id="1925234116" name=""/>
+                          <pic:cNvPicPr/>
+                        </pic:nvPicPr>
+                        <pic:blipFill>
+                          <a:blip r:embed="rId8"/>
+                          <a:stretch>
+                            <a:fillRect/>
+                          </a:stretch>
+                        </pic:blipFill>
+                        <pic:spPr>
+                          <a:xfrm>
+                            <a:off x="0" y="0"/>
+                            <a:ext cx="1000800" cy="1000800"/>
+                          </a:xfrm>
+                          <a:prstGeom prst="rect">
+                            <a:avLst/>
+                          </a:prstGeom>
+                        </pic:spPr>
+                      </pic:pic>
+                    </a:graphicData>
+                  </a:graphic>
+                </wp:inline>
+              </w:drawing>
             </w:r>
           </w:p>
           <w:p>
@@ -827,7 +899,7 @@
                 <w:sz w:val="17"/>
                 <w:szCs w:val="17"/>
               </w:rPr>
-              <w:t>—</w:t>
+              <w:t>Query design</w:t>
             </w:r>
           </w:p>
         </w:tc>
@@ -843,18 +915,50 @@
           </w:tcPr>
           <w:p>
             <w:pPr>
-              <w:spacing w:before="500" w:after="500"/>
               <w:jc w:val="center"/>
+              <w:rPr>
+                <w:noProof/>
+              </w:rPr>
             </w:pPr>
             <w:r>
               <w:rPr>
-                <w:i/>
-                <w:iCs/>
-                <w:color w:val="A6A6A6"/>
-                <w:sz w:val="18"/>
-                <w:szCs w:val="18"/>
-              </w:rPr>
-              <w:t>[Insert screenshot]</w:t>
+                <w:noProof/>
+              </w:rPr>
+              <w:drawing>
+                <wp:inline distT="0" distB="0" distL="0" distR="0" wp14:anchorId="1BEA01BB" wp14:editId="25A9E607">
+                  <wp:extent cx="1000800" cy="1000800"/>
+                  <wp:effectExtent l="0" t="0" r="8890" b="8890"/>
+                  <wp:docPr id="1326130651" name="Picture 1"/>
+                  <wp:cNvGraphicFramePr>
+                    <a:graphicFrameLocks xmlns:a="http://schemas.openxmlformats.org/drawingml/2006/main" noChangeAspect="1"/>
+                  </wp:cNvGraphicFramePr>
+                  <a:graphic xmlns:a="http://schemas.openxmlformats.org/drawingml/2006/main">
+                    <a:graphicData uri="http://schemas.openxmlformats.org/drawingml/2006/picture">
+                      <pic:pic xmlns:pic="http://schemas.openxmlformats.org/drawingml/2006/picture">
+                        <pic:nvPicPr>
+                          <pic:cNvPr id="1326130651" name=""/>
+                          <pic:cNvPicPr/>
+                        </pic:nvPicPr>
+                        <pic:blipFill>
+                          <a:blip r:embed="rId9"/>
+                          <a:stretch>
+                            <a:fillRect/>
+                          </a:stretch>
+                        </pic:blipFill>
+                        <pic:spPr>
+                          <a:xfrm>
+                            <a:off x="0" y="0"/>
+                            <a:ext cx="1000800" cy="1000800"/>
+                          </a:xfrm>
+                          <a:prstGeom prst="rect">
+                            <a:avLst/>
+                          </a:prstGeom>
+                        </pic:spPr>
+                      </pic:pic>
+                    </a:graphicData>
+                  </a:graphic>
+                </wp:inline>
+              </w:drawing>
             </w:r>
           </w:p>
           <w:p>
@@ -864,27 +968,23 @@
             </w:pPr>
             <w:r>
               <w:rPr>
-                <w:color w:val="595959"/>
-                <w:sz w:val="17"/>
-                <w:szCs w:val="17"/>
-              </w:rPr>
-              <w:t>—</w:t>
-            </w:r>
-          </w:p>
-          <w:p>
-            <w:pPr>
-              <w:spacing w:before="60" w:after="40"/>
-              <w:jc w:val="center"/>
-            </w:pPr>
-            <w:r>
-              <w:rPr>
                 <w:b/>
                 <w:bCs/>
                 <w:color w:val="000000"/>
                 <w:sz w:val="18"/>
                 <w:szCs w:val="18"/>
               </w:rPr>
-              <w:t>Distance: —</w:t>
+              <w:t xml:space="preserve">Distance: </w:t>
+            </w:r>
+            <w:r>
+              <w:rPr>
+                <w:b/>
+                <w:bCs/>
+                <w:color w:val="000000"/>
+                <w:sz w:val="18"/>
+                <w:szCs w:val="18"/>
+              </w:rPr>
+              <w:t>0.2280</w:t>
             </w:r>
           </w:p>
         </w:tc>
@@ -900,18 +1000,50 @@
           </w:tcPr>
           <w:p>
             <w:pPr>
-              <w:spacing w:before="500" w:after="500"/>
               <w:jc w:val="center"/>
+              <w:rPr>
+                <w:noProof/>
+              </w:rPr>
             </w:pPr>
             <w:r>
               <w:rPr>
-                <w:i/>
-                <w:iCs/>
-                <w:color w:val="A6A6A6"/>
-                <w:sz w:val="18"/>
-                <w:szCs w:val="18"/>
-              </w:rPr>
-              <w:t>[Insert screenshot]</w:t>
+                <w:noProof/>
+              </w:rPr>
+              <w:drawing>
+                <wp:inline distT="0" distB="0" distL="0" distR="0" wp14:anchorId="17E6B640" wp14:editId="4D9B4972">
+                  <wp:extent cx="1000800" cy="1000800"/>
+                  <wp:effectExtent l="0" t="0" r="8890" b="8890"/>
+                  <wp:docPr id="1740324605" name="Picture 1"/>
+                  <wp:cNvGraphicFramePr>
+                    <a:graphicFrameLocks xmlns:a="http://schemas.openxmlformats.org/drawingml/2006/main" noChangeAspect="1"/>
+                  </wp:cNvGraphicFramePr>
+                  <a:graphic xmlns:a="http://schemas.openxmlformats.org/drawingml/2006/main">
+                    <a:graphicData uri="http://schemas.openxmlformats.org/drawingml/2006/picture">
+                      <pic:pic xmlns:pic="http://schemas.openxmlformats.org/drawingml/2006/picture">
+                        <pic:nvPicPr>
+                          <pic:cNvPr id="1740324605" name=""/>
+                          <pic:cNvPicPr/>
+                        </pic:nvPicPr>
+                        <pic:blipFill>
+                          <a:blip r:embed="rId10"/>
+                          <a:stretch>
+                            <a:fillRect/>
+                          </a:stretch>
+                        </pic:blipFill>
+                        <pic:spPr>
+                          <a:xfrm>
+                            <a:off x="0" y="0"/>
+                            <a:ext cx="1000800" cy="1000800"/>
+                          </a:xfrm>
+                          <a:prstGeom prst="rect">
+                            <a:avLst/>
+                          </a:prstGeom>
+                        </pic:spPr>
+                      </pic:pic>
+                    </a:graphicData>
+                  </a:graphic>
+                </wp:inline>
+              </w:drawing>
             </w:r>
           </w:p>
           <w:p>
@@ -921,11 +1053,219 @@
             </w:pPr>
             <w:r>
               <w:rPr>
-                <w:color w:val="595959"/>
-                <w:sz w:val="17"/>
-                <w:szCs w:val="17"/>
-              </w:rPr>
-              <w:t>—</w:t>
+                <w:b/>
+                <w:bCs/>
+                <w:color w:val="000000"/>
+                <w:sz w:val="18"/>
+                <w:szCs w:val="18"/>
+              </w:rPr>
+              <w:t xml:space="preserve">Distance: </w:t>
+            </w:r>
+            <w:r>
+              <w:rPr>
+                <w:b/>
+                <w:bCs/>
+                <w:color w:val="000000"/>
+                <w:sz w:val="18"/>
+                <w:szCs w:val="18"/>
+              </w:rPr>
+              <w:t>0.2484</w:t>
+            </w:r>
+          </w:p>
+        </w:tc>
+      </w:tr>
+    </w:tbl>
+    <w:p>
+      <w:pPr>
+        <w:spacing w:before="240" w:after="100"/>
+      </w:pPr>
+      <w:r>
+        <w:rPr>
+          <w:sz w:val="21"/>
+          <w:szCs w:val="21"/>
+        </w:rPr>
+        <w:t xml:space="preserve">Example </w:t>
+      </w:r>
+      <w:r>
+        <w:rPr>
+          <w:sz w:val="21"/>
+          <w:szCs w:val="21"/>
+        </w:rPr>
+        <w:t>3</w:t>
+      </w:r>
+      <w:r>
+        <w:rPr>
+          <w:sz w:val="21"/>
+          <w:szCs w:val="21"/>
+        </w:rPr>
+        <w:t>:</w:t>
+      </w:r>
+    </w:p>
+    <w:tbl>
+      <w:tblPr>
+        <w:tblW w:w="8880" w:type="dxa"/>
+        <w:tblBorders>
+          <w:top w:val="single" w:sz="4" w:space="0" w:color="auto"/>
+          <w:left w:val="single" w:sz="4" w:space="0" w:color="auto"/>
+          <w:bottom w:val="single" w:sz="4" w:space="0" w:color="auto"/>
+          <w:right w:val="single" w:sz="4" w:space="0" w:color="auto"/>
+          <w:insideH w:val="single" w:sz="4" w:space="0" w:color="auto"/>
+          <w:insideV w:val="single" w:sz="4" w:space="0" w:color="auto"/>
+        </w:tblBorders>
+        <w:tblCellMar>
+          <w:left w:w="10" w:type="dxa"/>
+          <w:right w:w="10" w:type="dxa"/>
+        </w:tblCellMar>
+        <w:tblLook w:val="0000" w:firstRow="0" w:lastRow="0" w:firstColumn="0" w:lastColumn="0" w:noHBand="0" w:noVBand="0"/>
+      </w:tblPr>
+      <w:tblGrid>
+        <w:gridCol w:w="2960"/>
+        <w:gridCol w:w="2960"/>
+        <w:gridCol w:w="2960"/>
+      </w:tblGrid>
+      <w:tr>
+        <w:tc>
+          <w:tcPr>
+            <w:tcW w:w="2960" w:type="dxa"/>
+            <w:shd w:val="clear" w:color="auto" w:fill="1F4E78"/>
+            <w:tcMar>
+              <w:top w:w="80" w:type="dxa"/>
+              <w:left w:w="80" w:type="dxa"/>
+              <w:bottom w:w="80" w:type="dxa"/>
+              <w:right w:w="80" w:type="dxa"/>
+            </w:tcMar>
+          </w:tcPr>
+          <w:p>
+            <w:pPr>
+              <w:spacing w:before="60" w:after="40"/>
+              <w:jc w:val="center"/>
+            </w:pPr>
+            <w:r>
+              <w:rPr>
+                <w:b/>
+                <w:bCs/>
+                <w:color w:val="FFFFFF"/>
+                <w:sz w:val="19"/>
+                <w:szCs w:val="19"/>
+              </w:rPr>
+              <w:t>Query Part</w:t>
+            </w:r>
+          </w:p>
+        </w:tc>
+        <w:tc>
+          <w:tcPr>
+            <w:tcW w:w="2960" w:type="dxa"/>
+            <w:shd w:val="clear" w:color="auto" w:fill="1F4E78"/>
+            <w:tcMar>
+              <w:top w:w="80" w:type="dxa"/>
+              <w:left w:w="80" w:type="dxa"/>
+              <w:bottom w:w="80" w:type="dxa"/>
+              <w:right w:w="80" w:type="dxa"/>
+            </w:tcMar>
+          </w:tcPr>
+          <w:p>
+            <w:pPr>
+              <w:spacing w:before="60" w:after="40"/>
+              <w:jc w:val="center"/>
+            </w:pPr>
+            <w:r>
+              <w:rPr>
+                <w:b/>
+                <w:bCs/>
+                <w:color w:val="FFFFFF"/>
+                <w:sz w:val="19"/>
+                <w:szCs w:val="19"/>
+              </w:rPr>
+              <w:t>Match 1</w:t>
+            </w:r>
+          </w:p>
+        </w:tc>
+        <w:tc>
+          <w:tcPr>
+            <w:tcW w:w="2960" w:type="dxa"/>
+            <w:shd w:val="clear" w:color="auto" w:fill="1F4E78"/>
+            <w:tcMar>
+              <w:top w:w="80" w:type="dxa"/>
+              <w:left w:w="80" w:type="dxa"/>
+              <w:bottom w:w="80" w:type="dxa"/>
+              <w:right w:w="80" w:type="dxa"/>
+            </w:tcMar>
+          </w:tcPr>
+          <w:p>
+            <w:pPr>
+              <w:spacing w:before="60" w:after="40"/>
+              <w:jc w:val="center"/>
+            </w:pPr>
+            <w:r>
+              <w:rPr>
+                <w:b/>
+                <w:bCs/>
+                <w:color w:val="FFFFFF"/>
+                <w:sz w:val="19"/>
+                <w:szCs w:val="19"/>
+              </w:rPr>
+              <w:t>Match 2</w:t>
+            </w:r>
+          </w:p>
+        </w:tc>
+      </w:tr>
+      <w:tr>
+        <w:tc>
+          <w:tcPr>
+            <w:tcW w:w="2960" w:type="dxa"/>
+            <w:tcMar>
+              <w:top w:w="100" w:type="dxa"/>
+              <w:left w:w="80" w:type="dxa"/>
+              <w:bottom w:w="100" w:type="dxa"/>
+              <w:right w:w="80" w:type="dxa"/>
+            </w:tcMar>
+          </w:tcPr>
+          <w:p>
+            <w:pPr>
+              <w:jc w:val="center"/>
+              <w:rPr>
+                <w:noProof/>
+              </w:rPr>
+            </w:pPr>
+            <w:r>
+              <w:rPr>
+                <w:noProof/>
+              </w:rPr>
+              <w:drawing>
+                <wp:inline distT="0" distB="0" distL="0" distR="0" wp14:anchorId="359B5868" wp14:editId="0F842F17">
+                  <wp:extent cx="1000800" cy="1000800"/>
+                  <wp:effectExtent l="0" t="0" r="8890" b="8890"/>
+                  <wp:docPr id="1007969844" name="Picture 1"/>
+                  <wp:cNvGraphicFramePr>
+                    <a:graphicFrameLocks xmlns:a="http://schemas.openxmlformats.org/drawingml/2006/main" noChangeAspect="1"/>
+                  </wp:cNvGraphicFramePr>
+                  <a:graphic xmlns:a="http://schemas.openxmlformats.org/drawingml/2006/main">
+                    <a:graphicData uri="http://schemas.openxmlformats.org/drawingml/2006/picture">
+                      <pic:pic xmlns:pic="http://schemas.openxmlformats.org/drawingml/2006/picture">
+                        <pic:nvPicPr>
+                          <pic:cNvPr id="1007969844" name=""/>
+                          <pic:cNvPicPr/>
+                        </pic:nvPicPr>
+                        <pic:blipFill>
+                          <a:blip r:embed="rId11"/>
+                          <a:stretch>
+                            <a:fillRect/>
+                          </a:stretch>
+                        </pic:blipFill>
+                        <pic:spPr>
+                          <a:xfrm>
+                            <a:off x="0" y="0"/>
+                            <a:ext cx="1000800" cy="1000800"/>
+                          </a:xfrm>
+                          <a:prstGeom prst="rect">
+                            <a:avLst/>
+                          </a:prstGeom>
+                        </pic:spPr>
+                      </pic:pic>
+                    </a:graphicData>
+                  </a:graphic>
+                </wp:inline>
+              </w:drawing>
             </w:r>
           </w:p>
           <w:p>
@@ -935,18 +1275,199 @@
             </w:pPr>
             <w:r>
               <w:rPr>
+                <w:color w:val="595959"/>
+                <w:sz w:val="17"/>
+                <w:szCs w:val="17"/>
+              </w:rPr>
+              <w:t>Query design</w:t>
+            </w:r>
+          </w:p>
+        </w:tc>
+        <w:tc>
+          <w:tcPr>
+            <w:tcW w:w="2960" w:type="dxa"/>
+            <w:tcMar>
+              <w:top w:w="100" w:type="dxa"/>
+              <w:left w:w="80" w:type="dxa"/>
+              <w:bottom w:w="100" w:type="dxa"/>
+              <w:right w:w="80" w:type="dxa"/>
+            </w:tcMar>
+          </w:tcPr>
+          <w:p>
+            <w:pPr>
+              <w:jc w:val="center"/>
+              <w:rPr>
+                <w:noProof/>
+              </w:rPr>
+            </w:pPr>
+            <w:r>
+              <w:rPr>
+                <w:noProof/>
+              </w:rPr>
+              <w:drawing>
+                <wp:inline distT="0" distB="0" distL="0" distR="0" wp14:anchorId="07B7C15C" wp14:editId="443D9F4E">
+                  <wp:extent cx="1000800" cy="1000800"/>
+                  <wp:effectExtent l="0" t="0" r="8890" b="8890"/>
+                  <wp:docPr id="2073651185" name="Picture 1"/>
+                  <wp:cNvGraphicFramePr>
+                    <a:graphicFrameLocks xmlns:a="http://schemas.openxmlformats.org/drawingml/2006/main" noChangeAspect="1"/>
+                  </wp:cNvGraphicFramePr>
+                  <a:graphic xmlns:a="http://schemas.openxmlformats.org/drawingml/2006/main">
+                    <a:graphicData uri="http://schemas.openxmlformats.org/drawingml/2006/picture">
+                      <pic:pic xmlns:pic="http://schemas.openxmlformats.org/drawingml/2006/picture">
+                        <pic:nvPicPr>
+                          <pic:cNvPr id="2073651185" name=""/>
+                          <pic:cNvPicPr/>
+                        </pic:nvPicPr>
+                        <pic:blipFill>
+                          <a:blip r:embed="rId12"/>
+                          <a:stretch>
+                            <a:fillRect/>
+                          </a:stretch>
+                        </pic:blipFill>
+                        <pic:spPr>
+                          <a:xfrm>
+                            <a:off x="0" y="0"/>
+                            <a:ext cx="1000800" cy="1000800"/>
+                          </a:xfrm>
+                          <a:prstGeom prst="rect">
+                            <a:avLst/>
+                          </a:prstGeom>
+                        </pic:spPr>
+                      </pic:pic>
+                    </a:graphicData>
+                  </a:graphic>
+                </wp:inline>
+              </w:drawing>
+            </w:r>
+          </w:p>
+          <w:p>
+            <w:pPr>
+              <w:spacing w:before="60" w:after="40"/>
+              <w:jc w:val="center"/>
+            </w:pPr>
+            <w:r>
+              <w:rPr>
                 <w:b/>
                 <w:bCs/>
                 <w:color w:val="000000"/>
                 <w:sz w:val="18"/>
                 <w:szCs w:val="18"/>
               </w:rPr>
-              <w:t>Distance: —</w:t>
+              <w:t xml:space="preserve">Distance: </w:t>
+            </w:r>
+            <w:r>
+              <w:rPr>
+                <w:b/>
+                <w:bCs/>
+                <w:color w:val="000000"/>
+                <w:sz w:val="18"/>
+                <w:szCs w:val="18"/>
+              </w:rPr>
+              <w:t>0.0333</w:t>
+            </w:r>
+          </w:p>
+        </w:tc>
+        <w:tc>
+          <w:tcPr>
+            <w:tcW w:w="2960" w:type="dxa"/>
+            <w:tcMar>
+              <w:top w:w="100" w:type="dxa"/>
+              <w:left w:w="80" w:type="dxa"/>
+              <w:bottom w:w="100" w:type="dxa"/>
+              <w:right w:w="80" w:type="dxa"/>
+            </w:tcMar>
+          </w:tcPr>
+          <w:p>
+            <w:pPr>
+              <w:jc w:val="center"/>
+              <w:rPr>
+                <w:noProof/>
+              </w:rPr>
+            </w:pPr>
+            <w:r>
+              <w:rPr>
+                <w:noProof/>
+              </w:rPr>
+              <w:drawing>
+                <wp:inline distT="0" distB="0" distL="0" distR="0" wp14:anchorId="7E139D38" wp14:editId="1782BCA8">
+                  <wp:extent cx="1000800" cy="1000800"/>
+                  <wp:effectExtent l="0" t="0" r="8890" b="8890"/>
+                  <wp:docPr id="1474208596" name="Picture 1"/>
+                  <wp:cNvGraphicFramePr>
+                    <a:graphicFrameLocks xmlns:a="http://schemas.openxmlformats.org/drawingml/2006/main" noChangeAspect="1"/>
+                  </wp:cNvGraphicFramePr>
+                  <a:graphic xmlns:a="http://schemas.openxmlformats.org/drawingml/2006/main">
+                    <a:graphicData uri="http://schemas.openxmlformats.org/drawingml/2006/picture">
+                      <pic:pic xmlns:pic="http://schemas.openxmlformats.org/drawingml/2006/picture">
+                        <pic:nvPicPr>
+                          <pic:cNvPr id="1474208596" name=""/>
+                          <pic:cNvPicPr/>
+                        </pic:nvPicPr>
+                        <pic:blipFill>
+                          <a:blip r:embed="rId13"/>
+                          <a:stretch>
+                            <a:fillRect/>
+                          </a:stretch>
+                        </pic:blipFill>
+                        <pic:spPr>
+                          <a:xfrm>
+                            <a:off x="0" y="0"/>
+                            <a:ext cx="1000800" cy="1000800"/>
+                          </a:xfrm>
+                          <a:prstGeom prst="rect">
+                            <a:avLst/>
+                          </a:prstGeom>
+                        </pic:spPr>
+                      </pic:pic>
+                    </a:graphicData>
+                  </a:graphic>
+                </wp:inline>
+              </w:drawing>
+            </w:r>
+          </w:p>
+          <w:p>
+            <w:pPr>
+              <w:spacing w:before="60" w:after="40"/>
+              <w:jc w:val="center"/>
+            </w:pPr>
+            <w:r>
+              <w:rPr>
+                <w:b/>
+                <w:bCs/>
+                <w:color w:val="000000"/>
+                <w:sz w:val="18"/>
+                <w:szCs w:val="18"/>
+              </w:rPr>
+              <w:t xml:space="preserve">Distance: </w:t>
+            </w:r>
+            <w:r>
+              <w:rPr>
+                <w:b/>
+                <w:bCs/>
+                <w:color w:val="000000"/>
+                <w:sz w:val="18"/>
+                <w:szCs w:val="18"/>
+              </w:rPr>
+              <w:t>0.1201</w:t>
             </w:r>
           </w:p>
         </w:tc>
       </w:tr>
     </w:tbl>
+    <w:p>
+      <w:pPr>
+        <w:pStyle w:val="Heading1"/>
+        <w:spacing w:before="180" w:after="80"/>
+        <w:rPr>
+          <w:b/>
+          <w:bCs/>
+          <w:color w:val="1F4E78"/>
+          <w:sz w:val="24"/>
+          <w:szCs w:val="24"/>
+        </w:rPr>
+      </w:pPr>
+    </w:p>
     <w:p>
       <w:pPr>
         <w:pStyle w:val="Heading1"/>
@@ -972,8 +1493,13 @@
         </w:numPr>
         <w:spacing w:after="50"/>
       </w:pPr>
-      <w:r>
-        <w:t>Lets engineers check for a reusable existing design before starting from scratch, shortening design cycles.</w:t>
+      <w:proofErr w:type="gramStart"/>
+      <w:r>
+        <w:t>Lets</w:t>
+      </w:r>
+      <w:proofErr w:type="gramEnd"/>
+      <w:r>
+        <w:t xml:space="preserve"> engineers check for a reusable existing design before starting from scratch, shortening design cycles.</w:t>
       </w:r>
     </w:p>
     <w:p>
@@ -1730,7 +2256,6 @@
   <w:style w:type="character" w:default="1" w:styleId="DefaultParagraphFont">
     <w:name w:val="Default Paragraph Font"/>
     <w:uiPriority w:val="1"/>
-    <w:semiHidden/>
     <w:unhideWhenUsed/>
   </w:style>
   <w:style w:type="table" w:default="1" w:styleId="TableNormal">

</xml_diff>